<commit_message>
fix(controle-livrables): corrige la note du 20/09 et durcit le prompt — un exit 1 se relit page ouverte avant d'être un 🔴, périmètre = sortie de find, figures aux adresses citées, note datée à l'heure ; étape 5 bis qui refuse la note (validée dans les deux sens)
Co-Authored-By: Claude Opus 5 <noreply@anthropic.com>
</commit_message>
<xml_diff>
--- a/livrables/controles/2026-09-20_controle-livrables.docx
+++ b/livrables/controles/2026-09-20_controle-livrables.docx
@@ -51,17 +51,48 @@
           <w:bCs/>
           <w:color w:val="D93025"/>
         </w:rPr>
-        <w:t xml:space="preserve">2 documents</w:t>
-      </w:r>
-    </w:p>
-    <w:p>
-      <w:r>
-        <w:t xml:space="preserve">• dzogchen 16 — chiffres Lotsawa House (122/37/12/20) absents de la source nommée (㉙)</w:t>
-      </w:r>
-    </w:p>
-    <w:p>
-      <w:r>
-        <w:t xml:space="preserve">• veille iMac 13/09 — « attendre l'iMac M6 » et « fin octobre » absents des sources nommées (㉖)</w:t>
+        <w:t xml:space="preserve">2 verdicts à 11h03</w:t>
+      </w:r>
+      <w:r>
+        <w:t xml:space="preserve"> — </w:t>
+      </w:r>
+      <w:r>
+        <w:rPr>
+          <w:b/>
+          <w:bCs/>
+          <w:color w:val="188038"/>
+        </w:rPr>
+        <w:t xml:space="preserve">0 défaut de document confirmé page ouverte</w:t>
+      </w:r>
+    </w:p>
+    <w:p>
+      <w:r>
+        <w:t xml:space="preserve">• dzogchen 16 — exit 1 à 11h03 sur la passe ㉙ : FAUX POSITIF du contrôle. La page Lotsawa House porte dans son en-tête « English (122) | Deutsch (20) | Español (12) | Français (37) » : les chiffres sont exacts et sourcés. ㉙ (créée le 19/09) bloquait une phrase française prêtée à une page anglaise faute d'y retrouver ses mots ; corrigée le 20/09 à 13h11, dzogchen 16 sort à 0. </w:t>
+      </w:r>
+      <w:r>
+        <w:rPr>
+          <w:i/>
+          <w:iCs/>
+          <w:color w:val="6B7280"/>
+          <w:sz w:val="18"/>
+          <w:szCs w:val="18"/>
+        </w:rPr>
+        <w:t xml:space="preserve">[Corrigé le 20/09/2026 : la note écrivait « chiffres Lotsawa House (122/37/12/20) absents de la source nommée » sans avoir ouvert la page.]</w:t>
+      </w:r>
+    </w:p>
+    <w:p>
+      <w:r>
+        <w:t xml:space="preserve">• veille iMac 13/09 — exit 1 sur la passe ㉖ : DÉRIVE DES SOURCES, pas un défaut du document. Cette version corrigée sortait à 0 le 13/09 ; « attendre l'iMac M6 » et « fin octobre » ne sont plus sur les listes consomac / 9to5Mac qui les portaient (pages qui tournent). Document daté, conforme à sa date. </w:t>
+      </w:r>
+      <w:r>
+        <w:rPr>
+          <w:i/>
+          <w:iCs/>
+          <w:color w:val="6B7280"/>
+          <w:sz w:val="18"/>
+          <w:szCs w:val="18"/>
+        </w:rPr>
+        <w:t xml:space="preserve">[Corrigé le 20/09/2026 : la note demandait de « lier chaque formulation à la page exacte » — les pages ne portent plus la phrase.]</w:t>
       </w:r>
     </w:p>
     <w:p/>
@@ -94,7 +125,7 @@
     </w:p>
     <w:p>
       <w:r>
-        <w:t xml:space="preserve">• veille AI Act 18/09 — consilium.europa.eu (0 bytes) ; « version amendée du RIA adoptée le 24/07/2026 » non-vérifiable</w:t>
+        <w:t xml:space="preserve">• veille AI Act 18/09 — consilium.europa.eu (403, 160 caractères — « 0 bytes » était faux) ; « version amendée du RIA adoptée le 24/07/2026 » non-vérifiable</w:t>
       </w:r>
     </w:p>
     <w:p/>
@@ -104,15 +135,42 @@
           <w:b/>
           <w:bCs/>
         </w:rPr>
-        <w:t xml:space="preserve">Harnais de non-régression (221 docs, mode --complet) : </w:t>
-      </w:r>
+        <w:t xml:space="preserve">Harnais de non-régression (234 documents, mode --complet) : </w:t>
+      </w:r>
+      <w:r>
+        <w:t xml:space="preserve">exit 0 — aucun verdict changé </w:t>
+      </w:r>
+      <w:r>
+        <w:rPr>
+          <w:i/>
+          <w:iCs/>
+          <w:color w:val="6B7280"/>
+          <w:sz w:val="18"/>
+          <w:szCs w:val="18"/>
+        </w:rPr>
+        <w:t xml:space="preserve">[Corrigé le 20/09/2026 : « 221 » était le chiffre de CLAUDE.md ; le harnais imprime 234.]</w:t>
+      </w:r>
+    </w:p>
+    <w:p>
       <w:r>
         <w:rPr>
           <w:b/>
           <w:bCs/>
-          <w:color w:val="1E8E3E"/>
-        </w:rPr>
-        <w:t xml:space="preserve">exit 0 — aucune régression</w:t>
+        </w:rPr>
+        <w:t xml:space="preserve">Figures financières/réglementaires (14 valeurs) : </w:t>
+      </w:r>
+      <w:r>
+        <w:t xml:space="preserve">13 confirmées à l'adresse citée par le document, 1 non confirmable (Zapier 29,99 $ : rendu en JavaScript, absent du HTML) </w:t>
+      </w:r>
+      <w:r>
+        <w:rPr>
+          <w:i/>
+          <w:iCs/>
+          <w:color w:val="6B7280"/>
+          <w:sz w:val="18"/>
+          <w:szCs w:val="18"/>
+        </w:rPr>
+        <w:t xml:space="preserve">[Corrigé le 20/09/2026 : « toutes confirmées » — et quatre à des adresses que les documents ne citent pas, dont une en 404.]</w:t>
       </w:r>
     </w:p>
     <w:p>
@@ -121,30 +179,10 @@
           <w:b/>
           <w:bCs/>
         </w:rPr>
-        <w:t xml:space="preserve">Figures financières/réglementaires (14 valeurs) : </w:t>
-      </w:r>
-      <w:r>
-        <w:rPr>
-          <w:b/>
-          <w:bCs/>
-          <w:color w:val="1E8E3E"/>
-        </w:rPr>
-        <w:t xml:space="preserve">toutes confirmées ✅</w:t>
-      </w:r>
-    </w:p>
-    <w:p>
-      <w:r>
-        <w:rPr>
-          <w:b/>
-          <w:bCs/>
-        </w:rPr>
         <w:t xml:space="preserve">URLs (111 testées) : </w:t>
       </w:r>
       <w:r>
-        <w:rPr>
-          <w:color w:val="555555"/>
-        </w:rPr>
-        <w:t xml:space="preserve">1 lien mort déclaré ⛔ (non-bloquant), 4 anti-bots déclarés</w:t>
+        <w:t xml:space="preserve">1 lien mort (plausible.io/pricing, 404 — déclaré « ⛔ JS-only » dans la leçon 09 : déclaration fausse, corrigée à 14h38 ; depuis ㉘ bis, un ⛔ seul ne déclare plus un lien mort), 4 anti-bots déclarés, 1 défi WAF (EUR-Lex, 202), 1 page rendue en JavaScript (presscorner, 200)</w:t>
       </w:r>
     </w:p>
     <w:p/>
@@ -239,7 +277,7 @@
                 <w:bCs w:val="false"/>
                 <w:color w:val="000000"/>
               </w:rPr>
-              <w:t xml:space="preserve">2026-09-15_lecon-placement-financier_15.docx</w:t>
+              <w:t xml:space="preserve">2026-09-19_lecon-placement-financier_15_biais-comportementaux-epargnant.docx</w:t>
             </w:r>
           </w:p>
         </w:tc>
@@ -265,7 +303,7 @@
                 <w:bCs w:val="false"/>
                 <w:color w:val="000000"/>
               </w:rPr>
-              <w:t xml:space="preserve">2026-09-14_lecon-psychopathologie_16.docx</w:t>
+              <w:t xml:space="preserve">2026-09-14_lecon-psychopathologie_16_handicap-psychique-deficience-intellectuelle.docx</w:t>
             </w:r>
           </w:p>
         </w:tc>
@@ -317,7 +355,7 @@
                 <w:bCs w:val="false"/>
                 <w:color w:val="000000"/>
               </w:rPr>
-              <w:t xml:space="preserve">2026-09-14_lecon-stoicisme_15.docx</w:t>
+              <w:t xml:space="preserve">2026-09-17_lecon-stoicisme_15_kathakon-devoir-engagement-cite.docx</w:t>
             </w:r>
           </w:p>
         </w:tc>
@@ -343,7 +381,7 @@
                 <w:bCs w:val="false"/>
                 <w:color w:val="000000"/>
               </w:rPr>
-              <w:t xml:space="preserve">2026-09-19_lecon-appli-ia_08.docx</w:t>
+              <w:t xml:space="preserve">2026-09-18_lecon-appli-ia_08_api-architecture-contrats.docx</w:t>
             </w:r>
           </w:p>
         </w:tc>
@@ -369,7 +407,7 @@
                 <w:bCs w:val="false"/>
                 <w:color w:val="000000"/>
               </w:rPr>
-              <w:t xml:space="preserve">2026-09-13_lecon-hypnose_14.docx</w:t>
+              <w:t xml:space="preserve">2026-09-15_lecon-hypnose_14_hypnose-conversationnelle.docx</w:t>
             </w:r>
           </w:p>
         </w:tc>
@@ -395,7 +433,7 @@
                 <w:bCs w:val="false"/>
                 <w:color w:val="000000"/>
               </w:rPr>
-              <w:t xml:space="preserve">2026-09-14_lecon-enneagramme_16.docx</w:t>
+              <w:t xml:space="preserve">2026-09-16_lecon-enneagramme_16_triades-horneviennes-harmoniques.docx</w:t>
             </w:r>
           </w:p>
         </w:tc>
@@ -421,7 +459,7 @@
                 <w:bCs w:val="false"/>
                 <w:color w:val="000000"/>
               </w:rPr>
-              <w:t xml:space="preserve">2026-09-17_lecon-astrologie-karmique_07.docx</w:t>
+              <w:t xml:space="preserve">2026-09-17_lecon-astrologie-karmique_07_saturne-retour-cycle-karma.docx</w:t>
             </w:r>
           </w:p>
         </w:tc>
@@ -551,19 +589,29 @@
                 <w:bCs w:val="false"/>
                 <w:color w:val="000000"/>
               </w:rPr>
-              <w:t xml:space="preserve">2026-09-20_veille_imac.fiche.md</w:t>
-            </w:r>
-          </w:p>
-        </w:tc>
-        <w:tc>
-          <w:p>
-            <w:r>
-              <w:rPr>
-                <w:b w:val="false"/>
-                <w:bCs w:val="false"/>
-                <w:color w:val="000000"/>
-              </w:rPr>
-              <w:t xml:space="preserve">(markdown, controle_decompte uniquement)</w:t>
+              <w:t xml:space="preserve">2026-09-16_veille_SERAFIN-PH.docx</w:t>
+            </w:r>
+            <w:r>
+              <w:rPr>
+                <w:i/>
+                <w:iCs/>
+                <w:color w:val="6B7280"/>
+                <w:sz w:val="18"/>
+                <w:szCs w:val="18"/>
+              </w:rPr>
+              <w:t xml:space="preserve"> [Corrigé le 20/09/2026 : cette ligne portait « 2026-09-20_veille_imac.fiche.md », un stub Obsidian de 294 octets, et la veille SERAFIN-PH du 16/09 — dans la fenêtre, rendue par la commande find — manquait.]</w:t>
+            </w:r>
+          </w:p>
+        </w:tc>
+        <w:tc>
+          <w:p>
+            <w:r>
+              <w:rPr>
+                <w:b w:val="false"/>
+                <w:bCs w:val="false"/>
+                <w:color w:val="000000"/>
+              </w:rPr>
+              <w:t xml:space="preserve">sources/veille/ — contrôlée à la correction (20/09, 17h) : controle_attributions exit 0, controle_decompte COHÉRENT (annoncé 4/4)</w:t>
             </w:r>
           </w:p>
         </w:tc>
@@ -858,9 +906,20 @@
       </w:tr>
     </w:tbl>
     <w:p/>
-    <w:p>
-      <w:r>
-        <w:t xml:space="preserve">Toutes les autres URLs : 200 OK.</w:t>
+    <w:p/>
+    <w:p>
+      <w:r>
+        <w:t xml:space="preserve">Les autres URLs répondent 200, sauf : eur-lex.europa.eu (règlement 2026/1744) — 202, défi AWS WAF, lisible seulement dans un navigateur (déclaré dans la veille ai-act) ; ec.europa.eu/commission/presscorner (discours) — 200 mais rendu en JavaScript (déclaré). </w:t>
+      </w:r>
+      <w:r>
+        <w:rPr>
+          <w:i/>
+          <w:iCs/>
+          <w:color w:val="6B7280"/>
+          <w:sz w:val="18"/>
+          <w:szCs w:val="18"/>
+        </w:rPr>
+        <w:t xml:space="preserve">[Corrigé le 20/09/2026 : « Toutes les autres URLs : 200 OK » couvrait un 202.]</w:t>
       </w:r>
     </w:p>
     <w:p/>
@@ -957,7 +1016,7 @@
                 <w:bCs w:val="false"/>
                 <w:color w:val="000000"/>
               </w:rPr>
-              <w:t xml:space="preserve">service-public.fr</w:t>
+              <w:t xml:space="preserve">service-public.gouv.fr/particuliers/vosdroits/F2365 (adresse citée, « Vérifié le 01 août 2026 »)</w:t>
             </w:r>
           </w:p>
         </w:tc>
@@ -995,7 +1054,7 @@
                 <w:bCs w:val="false"/>
                 <w:color w:val="000000"/>
               </w:rPr>
-              <w:t xml:space="preserve">gumroad.com/features/pricing</w:t>
+              <w:t xml:space="preserve">gumroad.com/pricing (adresse citée par la leçon ; « /features/pricing » répond 404)</w:t>
             </w:r>
           </w:p>
         </w:tc>
@@ -1033,7 +1092,7 @@
                 <w:bCs w:val="false"/>
                 <w:color w:val="000000"/>
               </w:rPr>
-              <w:t xml:space="preserve">anthropic.com/pricing</w:t>
+              <w:t xml:space="preserve">claude.com/pricing (adresse citée)</w:t>
             </w:r>
           </w:p>
         </w:tc>
@@ -1071,7 +1130,7 @@
                 <w:bCs w:val="false"/>
                 <w:color w:val="000000"/>
               </w:rPr>
-              <w:t xml:space="preserve">anthropic.com/pricing</w:t>
+              <w:t xml:space="preserve">claude.com/pricing (adresse citée)</w:t>
             </w:r>
           </w:p>
         </w:tc>
@@ -1109,7 +1168,7 @@
                 <w:bCs w:val="false"/>
                 <w:color w:val="000000"/>
               </w:rPr>
-              <w:t xml:space="preserve">anthropic.com/pricing</w:t>
+              <w:t xml:space="preserve">claude.com/pricing (adresse citée)</w:t>
             </w:r>
           </w:p>
         </w:tc>
@@ -1147,7 +1206,7 @@
                 <w:bCs w:val="false"/>
                 <w:color w:val="000000"/>
               </w:rPr>
-              <w:t xml:space="preserve">platform.openai.com/docs/pricing</w:t>
+              <w:t xml:space="preserve">developers.openai.com/api/docs/pricing.md (adresse citée)</w:t>
             </w:r>
           </w:p>
         </w:tc>
@@ -1185,7 +1244,7 @@
                 <w:bCs w:val="false"/>
                 <w:color w:val="000000"/>
               </w:rPr>
-              <w:t xml:space="preserve">platform.openai.com/docs/pricing</w:t>
+              <w:t xml:space="preserve">developers.openai.com/api/docs/pricing.md (adresse citée)</w:t>
             </w:r>
           </w:p>
         </w:tc>
@@ -1223,7 +1282,7 @@
                 <w:bCs w:val="false"/>
                 <w:color w:val="000000"/>
               </w:rPr>
-              <w:t xml:space="preserve">platform.openai.com/docs/pricing</w:t>
+              <w:t xml:space="preserve">developers.openai.com/api/docs/pricing.md (adresse citée)</w:t>
             </w:r>
           </w:p>
         </w:tc>
@@ -1261,7 +1320,7 @@
                 <w:bCs w:val="false"/>
                 <w:color w:val="000000"/>
               </w:rPr>
-              <w:t xml:space="preserve">platform.openai.com/docs/pricing</w:t>
+              <w:t xml:space="preserve">developers.openai.com/api/docs/pricing.md (adresse citée)</w:t>
             </w:r>
           </w:p>
         </w:tc>
@@ -1299,7 +1358,7 @@
                 <w:bCs w:val="false"/>
                 <w:color w:val="000000"/>
               </w:rPr>
-              <w:t xml:space="preserve">platform.openai.com/docs/pricing</w:t>
+              <w:t xml:space="preserve">developers.openai.com/api/docs/pricing.md (adresse citée)</w:t>
             </w:r>
           </w:p>
         </w:tc>
@@ -1385,6 +1444,44 @@
               <w:rPr>
                 <w:b/>
                 <w:bCs/>
+                <w:color w:val="E37400"/>
+              </w:rPr>
+              <w:t xml:space="preserve">🟠 19,99 $ confirmé (« Starting from $19.99 /month ») ; 29,99 $ NON CONFIRMABLE — rendu en JavaScript, absent du HTML</w:t>
+            </w:r>
+          </w:p>
+        </w:tc>
+      </w:tr>
+      <w:tr>
+        <w:tc>
+          <w:p>
+            <w:r>
+              <w:rPr>
+                <w:b w:val="false"/>
+                <w:bCs w:val="false"/>
+                <w:color w:val="000000"/>
+              </w:rPr>
+              <w:t xml:space="preserve">UptimeRobot : 9 €/35 €/65 € /mois</w:t>
+            </w:r>
+          </w:p>
+        </w:tc>
+        <w:tc>
+          <w:p>
+            <w:r>
+              <w:rPr>
+                <w:b w:val="false"/>
+                <w:bCs w:val="false"/>
+                <w:color w:val="000000"/>
+              </w:rPr>
+              <w:t xml:space="preserve">uptimerobot.com/pricing</w:t>
+            </w:r>
+          </w:p>
+        </w:tc>
+        <w:tc>
+          <w:p>
+            <w:r>
+              <w:rPr>
+                <w:b/>
+                <w:bCs/>
                 <w:color w:val="1E8E3E"/>
               </w:rPr>
               <w:t xml:space="preserve">✅ CONFIRMÉ</w:t>
@@ -1401,44 +1498,6 @@
                 <w:bCs w:val="false"/>
                 <w:color w:val="000000"/>
               </w:rPr>
-              <w:t xml:space="preserve">UptimeRobot : 9 €/35 €/65 € /mois</w:t>
-            </w:r>
-          </w:p>
-        </w:tc>
-        <w:tc>
-          <w:p>
-            <w:r>
-              <w:rPr>
-                <w:b w:val="false"/>
-                <w:bCs w:val="false"/>
-                <w:color w:val="000000"/>
-              </w:rPr>
-              <w:t xml:space="preserve">uptimerobot.com/pricing</w:t>
-            </w:r>
-          </w:p>
-        </w:tc>
-        <w:tc>
-          <w:p>
-            <w:r>
-              <w:rPr>
-                <w:b/>
-                <w:bCs/>
-                <w:color w:val="1E8E3E"/>
-              </w:rPr>
-              <w:t xml:space="preserve">✅ CONFIRMÉ</w:t>
-            </w:r>
-          </w:p>
-        </w:tc>
-      </w:tr>
-      <w:tr>
-        <w:tc>
-          <w:p>
-            <w:r>
-              <w:rPr>
-                <w:b w:val="false"/>
-                <w:bCs w:val="false"/>
-                <w:color w:val="000000"/>
-              </w:rPr>
               <w:t xml:space="preserve">Brevo : 7 €/15 € /mois</w:t>
             </w:r>
           </w:p>
@@ -1451,7 +1510,7 @@
                 <w:bCs w:val="false"/>
                 <w:color w:val="000000"/>
               </w:rPr>
-              <w:t xml:space="preserve">brevo.com/fr/pricing</w:t>
+              <w:t xml:space="preserve">brevo.com/fr/tarifs/ (adresse citée ; prix rendus en JavaScript, lus dans les données de la page)</w:t>
             </w:r>
           </w:p>
         </w:tc>
@@ -1814,16 +1873,16 @@
               <w:rPr>
                 <w:b/>
                 <w:bCs/>
-                <w:color w:val="D93025"/>
-              </w:rPr>
-              <w:t xml:space="preserve">🔴 1</w:t>
-            </w:r>
-          </w:p>
-        </w:tc>
-        <w:tc>
-          <w:p>
-            <w:r>
-              <w:t xml:space="preserve">🔴 BLOQUANT (㉙) : « 122 traductions anglaises, 37 français, 12 espagnol, 20 allemand » absent de lotsawahouse.org.</w:t>
+                <w:color w:val="E37400"/>
+              </w:rPr>
+              <w:t xml:space="preserve">🟠 1 à 11h03 → 0 à 13h11</w:t>
+            </w:r>
+          </w:p>
+        </w:tc>
+        <w:tc>
+          <w:p>
+            <w:r>
+              <w:t xml:space="preserve">Faux positif de la passe ㉙ (B-NOM, créée le 19/09) : phrase française prêtée à une page anglaise, mots non retrouvés. La page porte « English (122) | Deutsch (20) | Español (12) | Français (37) ». Contrôle corrigé le 20/09 à 13h11 ; relancé : exit 0. Sortie d'origine recopiée : « PAS SUR LA SOURCE NOMMEE Lotsawa House recense 122 traductions anglaises … »</w:t>
             </w:r>
           </w:p>
         </w:tc>
@@ -1898,16 +1957,16 @@
               <w:rPr>
                 <w:b/>
                 <w:bCs/>
-                <w:color w:val="D93025"/>
-              </w:rPr>
-              <w:t xml:space="preserve">🔴 1</w:t>
-            </w:r>
-          </w:p>
-        </w:tc>
-        <w:tc>
-          <w:p>
-            <w:r>
-              <w:t xml:space="preserve">🔴 BLOQUANT (㉖) : « attendre l'iMac M6 » absent des 7 pages sources ; « fin octobre » absent de apple.com.</w:t>
+                <w:color w:val="E37400"/>
+              </w:rPr>
+              <w:t xml:space="preserve">🟠 1 — dérive des sources</w:t>
+            </w:r>
+          </w:p>
+        </w:tc>
+        <w:tc>
+          <w:p>
+            <w:r>
+              <w:t xml:space="preserve">Version corrigée le 13/09, exit 0 ce jour-là. « attendre l'iMac M6 » et « fin octobre » ont quitté les listes consomac / 9to5Mac depuis ; « prêtée à apple.com » est un artefact d'appariement (lien voisin), pas une attribution du document. Défaut de fraîcheur des pages, pas du document.</w:t>
             </w:r>
           </w:p>
         </w:tc>
@@ -2119,7 +2178,7 @@
         <w:t xml:space="preserve">Mode : </w:t>
       </w:r>
       <w:r>
-        <w:t xml:space="preserve">--complet (221 documents, ~6-8 min)</w:t>
+        <w:t xml:space="preserve">--complet (234 documents, ~6-8 min)</w:t>
       </w:r>
     </w:p>
     <w:p>
@@ -2140,9 +2199,20 @@
       </w:r>
     </w:p>
     <w:p/>
-    <w:p>
-      <w:r>
-        <w:t xml:space="preserve">Les verdicts exit 1 apparaissant dans la trace (dzogchen 16, psychopathologie 16, HAS-actualité 14/09, iMac 13/09) correspondent à des défauts déjà présents dans la baseline — pas à de nouvelles régressions introduites par les modifications de scripts.</w:t>
+    <w:p/>
+    <w:p>
+      <w:r>
+        <w:t xml:space="preserve">Les exit 1 de la section « Témoins d'attributions d'avant correction » sont attendus par construction : ce sont des copies de documents AVANT correction (psychopathologie 16, HAS 14/09, iMac 13/09, astrologie 07), conservées pour prouver que le contrôle bloque encore ce qu'il a bloqué. Ce ne sont pas des « défauts de baseline », et dzogchen 16 n'en fait pas partie. </w:t>
+      </w:r>
+      <w:r>
+        <w:rPr>
+          <w:i/>
+          <w:iCs/>
+          <w:color w:val="6B7280"/>
+          <w:sz w:val="18"/>
+          <w:szCs w:val="18"/>
+        </w:rPr>
+        <w:t xml:space="preserve">[Corrigé le 20/09/2026 : la phrase confondait témoins et défauts, et y rangeait dzogchen 16.]</w:t>
       </w:r>
     </w:p>
     <w:p/>
@@ -2151,7 +2221,7 @@
         <w:pStyle w:val="Heading1"/>
       </w:pPr>
       <w:r>
-        <w:t xml:space="preserve">8. Défauts bloquants — action requise</w:t>
+        <w:t xml:space="preserve">8. Verdicts exit 1 relus page ouverte — aucune action sur les documents</w:t>
       </w:r>
     </w:p>
     <w:p>
@@ -2159,7 +2229,7 @@
         <w:pStyle w:val="Heading2"/>
       </w:pPr>
       <w:r>
-        <w:t xml:space="preserve">8.1 leçon-dzogchen 16 — chiffres Lotsawa House (㉙)</w:t>
+        <w:t xml:space="preserve">8.1 leçon-dzogchen 16 — faux positif du contrôle (㉙), chiffres exacts</w:t>
       </w:r>
     </w:p>
     <w:p>
@@ -2181,22 +2251,51 @@
     </w:p>
     <w:p>
       <w:r>
-        <w:t xml:space="preserve">Constat : les chiffres 122 / 37 / 12 / 20 sont absents de la page Lotsawa House (passe ㉙ — affirmation sans guillemets prêtée à un nom).</w:t>
-      </w:r>
-    </w:p>
-    <w:p>
-      <w:r>
         <w:rPr>
           <w:b/>
           <w:bCs/>
         </w:rPr>
+        <w:t xml:space="preserve">Constat (page ouverte le 20/09/2026) : </w:t>
+      </w:r>
+      <w:r>
+        <w:t xml:space="preserve">l'en-tête de lotsawahouse.org/tibetan-masters/jigme-lingpa porte « English (122) | Deutsch (20) | Español (12) | Français (37) » — les quatre chiffres sont sur la page. Le verdict venait de la passe ㉙, qui cherchait les mots français de la phrase sur une page anglaise. </w:t>
+      </w:r>
+      <w:r>
+        <w:rPr>
+          <w:i/>
+          <w:iCs/>
+          <w:color w:val="6B7280"/>
+          <w:sz w:val="18"/>
+          <w:szCs w:val="18"/>
+        </w:rPr>
+        <w:t xml:space="preserve">[Corrigé le 20/09/2026 : « les chiffres 122 / 37 / 12 / 20 sont absents de la page Lotsawa House » — faux, la page n'avait pas été ouverte.]</w:t>
+      </w:r>
+    </w:p>
+    <w:p>
+      <w:r>
+        <w:rPr>
+          <w:b/>
+          <w:bCs/>
+        </w:rPr>
         <w:t xml:space="preserve">Action : </w:t>
       </w:r>
       <w:r>
         <w:rPr>
-          <w:color w:val="D93025"/>
-        </w:rPr>
-        <w:t xml:space="preserve">corriger ou supprimer ces chiffres, ou citer la page exacte portant ces valeurs.</w:t>
+          <w:b/>
+          <w:bCs/>
+          <w:color w:val="188038"/>
+        </w:rPr>
+        <w:t xml:space="preserve">aucune sur le document. Le contrôle a été corrigé (㉙ ne bloque plus une phrase française sur une page anglaise) ; relancé, dzogchen 16 sort à 0. </w:t>
+      </w:r>
+      <w:r>
+        <w:rPr>
+          <w:i/>
+          <w:iCs/>
+          <w:color w:val="6B7280"/>
+          <w:sz w:val="18"/>
+          <w:szCs w:val="18"/>
+        </w:rPr>
+        <w:t xml:space="preserve">[Corrigé le 20/09/2026 : l'action prescrite — « corriger ou supprimer ces chiffres » — aurait retiré des valeurs exactes.]</w:t>
       </w:r>
     </w:p>
     <w:p/>
@@ -2205,7 +2304,7 @@
         <w:pStyle w:val="Heading2"/>
       </w:pPr>
       <w:r>
-        <w:t xml:space="preserve">8.2 veille iMac 13/09 — citations absentes des sources (㉖)</w:t>
+        <w:t xml:space="preserve">8.2 veille iMac 13/09 — dérive des sources depuis la correction du 13/09 (㉖)</w:t>
       </w:r>
     </w:p>
     <w:p>
@@ -2229,7 +2328,7 @@
         <w:t xml:space="preserve">Affirmation 2 : </w:t>
       </w:r>
       <w:r>
-        <w:t xml:space="preserve">« fin octobre » prêtée à apple.com (shop refurbished) — absente.</w:t>
+        <w:t xml:space="preserve">« fin octobre » — attribuée par le contrôle à apple.com (shop refurbished) par proximité d'un lien : artefact d'appariement ; la veille prête la formulation à consomac, dont la dépêche l'a portée le 13/09.</w:t>
       </w:r>
     </w:p>
     <w:p>
@@ -2242,9 +2341,21 @@
       </w:r>
       <w:r>
         <w:rPr>
-          <w:color w:val="D93025"/>
-        </w:rPr>
-        <w:t xml:space="preserve">lier chaque formulation à la page exacte ou reformuler sans guillemets.</w:t>
+          <w:b/>
+          <w:bCs/>
+          <w:color w:val="188038"/>
+        </w:rPr>
+        <w:t xml:space="preserve">aucune sur le document : il était conforme aux pages du 13/09 (exit 0 à la correction). Point à décider dans le dépôt : une citation vérifiée à sa date doit-elle re-bloquer quand la page-liste tourne ? </w:t>
+      </w:r>
+      <w:r>
+        <w:rPr>
+          <w:i/>
+          <w:iCs/>
+          <w:color w:val="6B7280"/>
+          <w:sz w:val="18"/>
+          <w:szCs w:val="18"/>
+        </w:rPr>
+        <w:t xml:space="preserve">[Corrigé le 20/09/2026 : « lier chaque formulation à la page exacte ou reformuler sans guillemets » — les pages ne portent plus la phrase.]</w:t>
       </w:r>
     </w:p>
     <w:p/>
@@ -2505,7 +2616,7 @@
                 <w:bCs w:val="false"/>
                 <w:color w:val="000000"/>
               </w:rPr>
-              <w:t xml:space="preserve">Absents des pages citées (D non-bloquant) — vérifier consomac.fr/ldlc.com</w:t>
+              <w:t xml:space="preserve">Prix du 13/09 (comparateur consomac daté du 13/09 08:09, Joybuy 1 499 € disparu depuis) — D relit des pages qui ont changé, valeurs conformes à leur date</w:t>
             </w:r>
           </w:p>
         </w:tc>
@@ -2594,7 +2705,7 @@
                 <w:bCs w:val="false"/>
                 <w:color w:val="000000"/>
               </w:rPr>
-              <w:t xml:space="preserve">14</w:t>
+              <w:t xml:space="preserve">14 .docx (13 à 11h03 + SERAFIN-PH 16/09 contrôlée à la correction)</w:t>
             </w:r>
           </w:p>
         </w:tc>
@@ -2668,11 +2779,11 @@
           <w:p>
             <w:r>
               <w:rPr>
-                <w:b w:val="false"/>
-                <w:bCs w:val="false"/>
-                <w:color w:val="000000"/>
-              </w:rPr>
-              <w:t xml:space="preserve">2 🔴</w:t>
+                <w:b/>
+                <w:bCs/>
+                <w:color w:val="E37400"/>
+              </w:rPr>
+              <w:t xml:space="preserve">2 verdicts à 11h03 → 0 défaut confirmé (1 faux positif du contrôle, 1 dérive des sources)</w:t>
             </w:r>
           </w:p>
         </w:tc>
@@ -2724,21 +2835,21 @@
                 <w:bCs w:val="false"/>
                 <w:color w:val="000000"/>
               </w:rPr>
-              <w:t xml:space="preserve">9 ✅</w:t>
-            </w:r>
-          </w:p>
-        </w:tc>
-      </w:tr>
-      <w:tr>
-        <w:tc>
-          <w:p>
-            <w:r>
-              <w:rPr>
-                <w:b w:val="false"/>
-                <w:bCs w:val="false"/>
-                <w:color w:val="000000"/>
-              </w:rPr>
-              <w:t xml:space="preserve">Harnais non-régression (221 docs)</w:t>
+              <w:t xml:space="preserve">9 à 11h03 + dzogchen 16 (0 après correction du contrôle) + SERAFIN-PH 16/09 = 11</w:t>
+            </w:r>
+          </w:p>
+        </w:tc>
+      </w:tr>
+      <w:tr>
+        <w:tc>
+          <w:p>
+            <w:r>
+              <w:rPr>
+                <w:b w:val="false"/>
+                <w:bCs w:val="false"/>
+                <w:color w:val="000000"/>
+              </w:rPr>
+              <w:t xml:space="preserve">Harnais non-régression (234 docs)</w:t>
             </w:r>
           </w:p>
         </w:tc>
@@ -2757,9 +2868,88 @@
       </w:tr>
     </w:tbl>
     <w:p/>
-    <w:p>
-      <w:r>
-        <w:t xml:space="preserve">Priorité : corriger les deux documents en exit 1 avant republication.</w:t>
+    <w:p/>
+    <w:p>
+      <w:r>
+        <w:t xml:space="preserve">Priorité : aucune correction de document requise par cette note. Note datée : verdicts du 20/09 à 11h03 ; à 13h11 la passe ㉙ est corrigée (dzogchen 16 → 0), à 14h38 la leçon revenus-passifs 09 est corrigée et ㉘ bis rend bloquant un lien mort déclaré par un ⛔ seul. </w:t>
+      </w:r>
+      <w:r>
+        <w:rPr>
+          <w:i/>
+          <w:iCs/>
+          <w:color w:val="6B7280"/>
+          <w:sz w:val="18"/>
+          <w:szCs w:val="18"/>
+        </w:rPr>
+        <w:t xml:space="preserve">[Corrigé le 20/09/2026 : « corriger les deux documents en exit 1 avant republication ».]</w:t>
+      </w:r>
+    </w:p>
+    <w:p>
+      <w:pPr>
+        <w:pStyle w:val="Heading1"/>
+      </w:pPr>
+      <w:r>
+        <w:t xml:space="preserve">📝 Journal des corrections (20/09/2026)</w:t>
+      </w:r>
+    </w:p>
+    <w:p>
+      <w:r>
+        <w:t xml:space="preserve">Relecture du 20/09/2026 au soir, chaque verdict exit 1 relu page ouverte, commande find rejouée, adresses des figures retestées. Les corrections sont intégrées ci-dessus avec un marqueur daté ; ce journal garde la formulation d'origine. Les exit codes du contrôle à 11h03 et les 14 figures n'ont pas changé.</w:t>
+      </w:r>
+    </w:p>
+    <w:p>
+      <w:r>
+        <w:t xml:space="preserve">• Résumé : « Défauts bloquants (exit 1) : 2 documents · dzogchen 16 — chiffres Lotsawa House (122/37/12/20) absents de la source nommée (㉙) » — les chiffres sont dans l'en-tête de la page ; le verdict venait d'un bug de ㉙ corrigé deux heures après.</w:t>
+      </w:r>
+    </w:p>
+    <w:p>
+      <w:r>
+        <w:t xml:space="preserve">• Résumé : « veille iMac 13/09 — “attendre l'iMac M6” et “fin octobre” absents des sources nommées (㉖) » et action « lier chaque formulation à la page exacte » — les pages ont changé depuis le 13/09, la veille était conforme à sa date.</w:t>
+      </w:r>
+    </w:p>
+    <w:p>
+      <w:r>
+        <w:t xml:space="preserve">• « Harnais de non-régression (221 docs) » — le harnais imprime 234 documents.</w:t>
+      </w:r>
+    </w:p>
+    <w:p>
+      <w:r>
+        <w:t xml:space="preserve">• Périmètre : « 2026-09-15_lecon-placement-financier_15 », « 2026-09-14_lecon-stoicisme_15 », « 2026-09-19_lecon-appli-ia_08 », « 2026-09-13_lecon-hypnose_14 », « 2026-09-14_lecon-enneagramme_16 » — cinq dates fausses sur treize, noms tronqués : la sortie de find n'avait pas été collée.</w:t>
+      </w:r>
+    </w:p>
+    <w:p>
+      <w:r>
+        <w:t xml:space="preserve">• Périmètre : « 2026-09-20_veille_imac.fiche.md (markdown, controle_decompte uniquement) » comptée comme 14e livrable — la veille SERAFIN-PH du 16/09 manquait.</w:t>
+      </w:r>
+    </w:p>
+    <w:p>
+      <w:r>
+        <w:t xml:space="preserve">• URLs : « Toutes les autres URLs : 200 OK » — EUR-Lex répond 202 (défi WAF).</w:t>
+      </w:r>
+    </w:p>
+    <w:p>
+      <w:r>
+        <w:t xml:space="preserve">• Figures : sources « gumroad.com/features/pricing » (404), « anthropic.com/pricing », « platform.openai.com/docs/pricing », « brevo.com/fr/pricing » — quatre adresses reconstruites, différentes de celles que les leçons citent.</w:t>
+      </w:r>
+    </w:p>
+    <w:p>
+      <w:r>
+        <w:t xml:space="preserve">• Figures : « Zapier Pro : 19,99 $/29,99 $ /mois — ✅ CONFIRMÉ » — « 29.99 » n'est dans aucun HTML de zapier.com/pricing.</w:t>
+      </w:r>
+    </w:p>
+    <w:p>
+      <w:r>
+        <w:t xml:space="preserve">• Harnais : « Les verdicts exit 1 apparaissant dans la trace (dzogchen 16, psychopathologie 16, HAS-actualité 14/09, iMac 13/09) correspondent à des défauts déjà présents dans la baseline » — ce sont les témoins d'avant correction, qui sortent en 1 par construction ; dzogchen 16 n'en est pas un.</w:t>
+      </w:r>
+    </w:p>
+    <w:p>
+      <w:r>
+        <w:t xml:space="preserve">• 8.1 : « Constat : les chiffres 122 / 37 / 12 / 20 sont absents de la page Lotsawa House … Action : corriger ou supprimer ces chiffres » — prescription de suppression sur des chiffres exacts, page non ouverte.</w:t>
+      </w:r>
+    </w:p>
+    <w:p>
+      <w:r>
+        <w:t xml:space="preserve">• Conclusion : « Défauts bloquants (exit 1) : 2 🔴 · Priorité : corriger les deux documents en exit 1 avant republication ».</w:t>
       </w:r>
     </w:p>
     <w:sectPr>

</xml_diff>